<commit_message>
Update hotel location details, proximity guides, and fix gallery bugs
- Updated hotel address to #40E Street 2004, Sen Sok in contact and footer layouts.

- Corrected room count to 41 and property size to 817 m² in the About page.

- Updated the main hotel image on the About page.

- Removed Phnom Penh Airport from the proximity/neighborhood guides on the Home and About pages.

- Adjusted grid layouts to center the remaining proximity cards.

- Fixed 500 server error on the public gallery page caused by a Collection merge conflict.

- Fixed broken images in the admin gallery view by updating asset paths to 'gallery_images'.
</commit_message>
<xml_diff>
--- a/z_documentation/AI_prompts/Prompt 1.docx
+++ b/z_documentation/AI_prompts/Prompt 1.docx
@@ -136,6 +136,9 @@
         <w:t xml:space="preserve">3. In payment page, Remove this </w:t>
       </w:r>
       <w:r>
+        <w:rPr>
+          <w:noProof/>
+        </w:rPr>
         <w:drawing>
           <wp:inline distT="0" distB="0" distL="0" distR="0" wp14:anchorId="3D35747F" wp14:editId="46C300E1">
             <wp:extent cx="5829805" cy="2110923"/>
@@ -188,6 +191,9 @@
         <w:t xml:space="preserve">5. In this page, the adults and children don’t need dropdown. Instead, it should just tell the guests plainly about the room’s occupancy. </w:t>
       </w:r>
       <w:r>
+        <w:rPr>
+          <w:noProof/>
+        </w:rPr>
         <w:drawing>
           <wp:inline distT="0" distB="0" distL="0" distR="0" wp14:anchorId="65BA9F51" wp14:editId="342D622C">
             <wp:extent cx="5943600" cy="3502660"/>
@@ -283,6 +289,9 @@
         <w:t xml:space="preserve"> Obviously, the system will remember guests’ data inputs.</w:t>
       </w:r>
       <w:r>
+        <w:rPr>
+          <w:noProof/>
+        </w:rPr>
         <w:drawing>
           <wp:inline distT="0" distB="0" distL="0" distR="0" wp14:anchorId="09090331" wp14:editId="6024FD0E">
             <wp:extent cx="5943600" cy="4355465"/>
@@ -329,6 +338,9 @@
         <w:t>Template for adults and children dropdown.</w:t>
       </w:r>
       <w:r>
+        <w:rPr>
+          <w:noProof/>
+        </w:rPr>
         <w:drawing>
           <wp:inline distT="0" distB="0" distL="0" distR="0" wp14:anchorId="3CBF91DC" wp14:editId="1C4B7001">
             <wp:extent cx="3673158" cy="2743438"/>
@@ -375,6 +387,9 @@
         <w:t>Similar to point 5 and 6, instead of room type dropdown, replace it with adults and children dropdown.</w:t>
       </w:r>
       <w:r>
+        <w:rPr>
+          <w:noProof/>
+        </w:rPr>
         <w:drawing>
           <wp:inline distT="0" distB="0" distL="0" distR="0" wp14:anchorId="6B416FFE" wp14:editId="0FF967FB">
             <wp:extent cx="5943600" cy="854075"/>
@@ -590,19 +605,7 @@
           <w:noProof/>
         </w:rPr>
         <w:lastRenderedPageBreak/>
-        <w:t xml:space="preserve">10. </w:t>
-      </w:r>
-      <w:r>
-        <w:rPr>
-          <w:noProof/>
-        </w:rPr>
-        <w:t>Remove the ABA Tran ID in payment page</w:t>
-      </w:r>
-      <w:r>
-        <w:rPr>
-          <w:noProof/>
-        </w:rPr>
-        <w:t>.</w:t>
+        <w:t>10. Remove the ABA Tran ID in payment page.</w:t>
       </w:r>
       <w:r>
         <w:rPr>
@@ -728,9 +731,111 @@
     </w:p>
     <w:p/>
     <w:p>
+      <w:r>
+        <w:t xml:space="preserve">12. Consider that admin might want to export the report that tells him about the relevant information of the hotel. Evaluate the admin’s current dashboard whether it fulfills what a dashboard should be. </w:t>
+      </w:r>
+      <w:r>
+        <w:t>Maybe add a pending refund in the dashboard that links to the list of refund pending.</w:t>
+      </w:r>
+    </w:p>
+    <w:p/>
+    <w:p>
+      <w:r>
+        <w:t xml:space="preserve">13. The payment gateway management can’t be deployed as it is. Hide the payment gateway management from Admin page. Don’t remove it from the codebase though. </w:t>
+      </w:r>
+      <w:r>
+        <w:drawing>
+          <wp:inline distT="0" distB="0" distL="0" distR="0" wp14:anchorId="6288DB26" wp14:editId="374C24C3">
+            <wp:extent cx="2377646" cy="1348857"/>
+            <wp:effectExtent l="0" t="0" r="3810" b="3810"/>
+            <wp:docPr id="667353202" name="Picture 1"/>
+            <wp:cNvGraphicFramePr>
+              <a:graphicFrameLocks xmlns:a="http://schemas.openxmlformats.org/drawingml/2006/main" noChangeAspect="1"/>
+            </wp:cNvGraphicFramePr>
+            <a:graphic xmlns:a="http://schemas.openxmlformats.org/drawingml/2006/main">
+              <a:graphicData uri="http://schemas.openxmlformats.org/drawingml/2006/picture">
+                <pic:pic xmlns:pic="http://schemas.openxmlformats.org/drawingml/2006/picture">
+                  <pic:nvPicPr>
+                    <pic:cNvPr id="667353202" name=""/>
+                    <pic:cNvPicPr/>
+                  </pic:nvPicPr>
+                  <pic:blipFill>
+                    <a:blip r:embed="rId15"/>
+                    <a:stretch>
+                      <a:fillRect/>
+                    </a:stretch>
+                  </pic:blipFill>
+                  <pic:spPr>
+                    <a:xfrm>
+                      <a:off x="0" y="0"/>
+                      <a:ext cx="2377646" cy="1348857"/>
+                    </a:xfrm>
+                    <a:prstGeom prst="rect">
+                      <a:avLst/>
+                    </a:prstGeom>
+                  </pic:spPr>
+                </pic:pic>
+              </a:graphicData>
+            </a:graphic>
+          </wp:inline>
+        </w:drawing>
+      </w:r>
+    </w:p>
+    <w:p/>
+    <w:p>
+      <w:r>
+        <w:t xml:space="preserve">14. </w:t>
+      </w:r>
+      <w:r>
+        <w:t xml:space="preserve">The hotel website should also have a gallery page that shows the view of the hotel. </w:t>
+      </w:r>
+      <w:r>
+        <w:t xml:space="preserve">Add the gallery button in between Room and About </w:t>
+      </w:r>
+      <w:r>
+        <w:drawing>
+          <wp:inline distT="0" distB="0" distL="0" distR="0" wp14:anchorId="55D69190" wp14:editId="239B2BCA">
+            <wp:extent cx="5296359" cy="624894"/>
+            <wp:effectExtent l="0" t="0" r="0" b="3810"/>
+            <wp:docPr id="1938070144" name="Picture 1"/>
+            <wp:cNvGraphicFramePr>
+              <a:graphicFrameLocks xmlns:a="http://schemas.openxmlformats.org/drawingml/2006/main" noChangeAspect="1"/>
+            </wp:cNvGraphicFramePr>
+            <a:graphic xmlns:a="http://schemas.openxmlformats.org/drawingml/2006/main">
+              <a:graphicData uri="http://schemas.openxmlformats.org/drawingml/2006/picture">
+                <pic:pic xmlns:pic="http://schemas.openxmlformats.org/drawingml/2006/picture">
+                  <pic:nvPicPr>
+                    <pic:cNvPr id="1938070144" name=""/>
+                    <pic:cNvPicPr/>
+                  </pic:nvPicPr>
+                  <pic:blipFill>
+                    <a:blip r:embed="rId16"/>
+                    <a:stretch>
+                      <a:fillRect/>
+                    </a:stretch>
+                  </pic:blipFill>
+                  <pic:spPr>
+                    <a:xfrm>
+                      <a:off x="0" y="0"/>
+                      <a:ext cx="5296359" cy="624894"/>
+                    </a:xfrm>
+                    <a:prstGeom prst="rect">
+                      <a:avLst/>
+                    </a:prstGeom>
+                  </pic:spPr>
+                </pic:pic>
+              </a:graphicData>
+            </a:graphic>
+          </wp:inline>
+        </w:drawing>
+      </w:r>
+      <w:r>
+        <w:t>. The gallery will show what the admin uploads into the gallery, including the images of the room in the sliders. Also, evaluate whether the room module, specifically on the admin side, is industrial standard.</w:t>
+      </w:r>
+    </w:p>
+    <w:p>
       <w:pPr>
         <w:rPr>
-          <w:rFonts w:hint="cs"/>
           <w:cs/>
         </w:rPr>
       </w:pPr>

</xml_diff>